<commit_message>
Se crea la salida de base de datos real para seguimiento y controld e acuerdo a las directrices dadas por el equipo
</commit_message>
<xml_diff>
--- a/output_abogados/Ana_Maria_Guzman_Acosta/WORDS/aviso/OFICIO_60182_PACÍFICO_SALDAÑA_FEO.docx
+++ b/output_abogados/Ana_Maria_Guzman_Acosta/WORDS/aviso/OFICIO_60182_PACÍFICO_SALDAÑA_FEO.docx
@@ -154,6 +154,17 @@
         </w:rPr>
         <w:t>Expediente 60182 - Notificación por aviso  Resolución DJUR No. 50257000785  del 9 de Octubre de 2025 .</w:t>
       </w:r>
+    </w:p>
+    <w:p>
+      <w:pPr>
+        <w:pStyle w:val="Sinespaciado"/>
+        <w:rPr>
+          <w:rFonts w:ascii="Arial" w:hAnsi="Arial" w:cs="Arial"/>
+          <w:sz w:val="24"/>
+          <w:szCs w:val="24"/>
+          <w:highlight w:val="yellow"/>
+        </w:rPr>
+      </w:pPr>
     </w:p>
     <w:p>
       <w:pPr>

</xml_diff>